<commit_message>
v3.4: release the data Sections 5 and 6 depend on, cite the concept DOI
Adds cluster_bootstrap.json and design_effect_corrected.json, which carry the z
values Section 6 reports; publisher_clustering.json and publisher_icc.json, which
are the whole of Section 5; the intermediate samples Sections 1, 3, 4 and 6.1 are
computed from; and the per-package validation records, without which a reader can
only sum two arm summaries and reproduce the figure revision 3.1 retracts.

Version 3.3 cited 10.5281/zenodo.22664719 as the archive of itself. That record
is labelled v3.3 but contains the v3.1 tree, because the v3.3 tag was placed on
the v3.1 commit. The paper now cites the concept DOI 10.5281/zenodo.22641812.
</commit_message>
<xml_diff>
--- a/paper/mcp-frame-paper-v3.docx
+++ b/paper/mcp-frame-paper-v3.docx
@@ -74,7 +74,7 @@
           <w:sz w:val="21"/>
           <w:szCs w:val="21"/>
         </w:rPr>
-        <w:t xml:space="preserve">Version 3.3, 8 September 2026</w:t>
+        <w:t xml:space="preserve">Version 3.4, 8 September 2026</w:t>
       </w:r>
     </w:p>
     <w:p>
@@ -10185,7 +10185,7 @@
           <w:sz w:val="21"/>
           <w:szCs w:val="21"/>
         </w:rPr>
-        <w:t xml:space="preserve">Version 3.3, this version, is archived at DOI 10.5281/zenodo.22664719.</w:t>
+        <w:t xml:space="preserve">Archived at DOI 10.5281/zenodo.22641812.</w:t>
       </w:r>
     </w:p>
     <w:p>
@@ -10204,25 +10204,37 @@
           <w:sz w:val="21"/>
           <w:szCs w:val="21"/>
         </w:rPr>
-        <w:t xml:space="preserve">Cite that DOI for this version. DOI 10.5281/zenodo.22641813 archives </w:t>
-      </w:r>
-      <w:r>
-        <w:rPr>
-          <w:rFonts w:ascii="Georgia" w:cs="Georgia" w:eastAsia="Georgia" w:hAnsi="Georgia"/>
-          <w:b/>
-          <w:bCs/>
-          <w:sz w:val="21"/>
-          <w:szCs w:val="21"/>
-        </w:rPr>
-        <w:t xml:space="preserve">version 1.0.0 only</w:t>
-      </w:r>
-      <w:r>
-        <w:rPr>
-          <w:rFonts w:ascii="Georgia" w:cs="Georgia" w:eastAsia="Georgia" w:hAnsi="Georgia"/>
-          <w:sz w:val="21"/>
-          <w:szCs w:val="21"/>
-        </w:rPr>
-        <w:t xml:space="preserve">, under its original title, "Measuring the MCP Supply Chain: Eight Null Results and a Population That Is Not the Population". Its findings are superseded here, so citing it for this version would cite the paper this one exists to correct. Versions 1.0.1, 1.0.2 and 2.0 were never archived; versions of this paper before 3.3 stated that 2.0 had its own DOI, which was not true.</w:t>
+        <w:t xml:space="preserve">Cite that DOI. It is the concept DOI, which resolves to the most recent archived version, so it does not go stale as this paper is revised.</w:t>
+      </w:r>
+    </w:p>
+    <w:p>
+      <w:pPr>
+        <w:spacing w:after="160"/>
+        <w:jc w:val="left"/>
+      </w:pPr>
+      <w:r>
+        <w:rPr>
+          <w:rFonts w:ascii="Georgia" w:cs="Georgia" w:eastAsia="Georgia" w:hAnsi="Georgia"/>
+          <w:sz w:val="21"/>
+          <w:szCs w:val="21"/>
+        </w:rPr>
+        <w:t xml:space="preserve">The version DOIs are more specific and, in one case, misleading. 10.5281/zenodo.22641813 archives version 1.0.0 under its original title, "Measuring the MCP Supply Chain: Eight Null Results and a Population That Is Not the Population", whose findings are superseded here. 10.5281/zenodo.22664719 is labelled version 3.3 but archives the version 3.1 tree, because the </w:t>
+      </w:r>
+      <w:r>
+        <w:rPr>
+          <w:rFonts w:ascii="Consolas" w:cs="Consolas" w:eastAsia="Consolas" w:hAnsi="Consolas"/>
+          <w:sz w:val="19"/>
+          <w:szCs w:val="19"/>
+        </w:rPr>
+        <w:t xml:space="preserve">v3.3</w:t>
+      </w:r>
+      <w:r>
+        <w:rPr>
+          <w:rFonts w:ascii="Georgia" w:cs="Georgia" w:eastAsia="Georgia" w:hAnsi="Georgia"/>
+          <w:sz w:val="21"/>
+          <w:szCs w:val="21"/>
+        </w:rPr>
+        <w:t xml:space="preserve"> git tag was placed on the version 3.1 commit and Zenodo archives whatever the tag points at. It contains neither the Section 6 correction nor the lock format proposal. Versions 1.0.1, 1.0.2 and 2.0 were never archived, and versions of this paper before 3.3 stated that 2.0 had its own DOI, which was not true.</w:t>
       </w:r>
     </w:p>
     <w:p>
@@ -10767,6 +10779,110 @@
           <w:szCs w:val="21"/>
         </w:rPr>
         <w:t xml:space="preserve"> described version 1.0.2 under the old title and are rewritten.</w:t>
+      </w:r>
+    </w:p>
+    <w:p>
+      <w:pPr>
+        <w:spacing w:after="160"/>
+        <w:jc w:val="left"/>
+      </w:pPr>
+      <w:r>
+        <w:rPr>
+          <w:rFonts w:ascii="Georgia" w:cs="Georgia" w:eastAsia="Georgia" w:hAnsi="Georgia"/>
+          <w:b/>
+          <w:bCs/>
+          <w:sz w:val="21"/>
+          <w:szCs w:val="21"/>
+        </w:rPr>
+        <w:t xml:space="preserve">3.4</w:t>
+      </w:r>
+      <w:r>
+        <w:rPr>
+          <w:rFonts w:ascii="Georgia" w:cs="Georgia" w:eastAsia="Georgia" w:hAnsi="Georgia"/>
+          <w:sz w:val="21"/>
+          <w:szCs w:val="21"/>
+        </w:rPr>
+        <w:t xml:space="preserve"> Corrected the archive references. Version 3.3 cited 10.5281/zenodo.22664719 as the archive of itself. That record is labelled version 3.3 but contains the version 3.1 tree, because the </w:t>
+      </w:r>
+      <w:r>
+        <w:rPr>
+          <w:rFonts w:ascii="Consolas" w:cs="Consolas" w:eastAsia="Consolas" w:hAnsi="Consolas"/>
+          <w:sz w:val="19"/>
+          <w:szCs w:val="19"/>
+        </w:rPr>
+        <w:t xml:space="preserve">v3.3</w:t>
+      </w:r>
+      <w:r>
+        <w:rPr>
+          <w:rFonts w:ascii="Georgia" w:cs="Georgia" w:eastAsia="Georgia" w:hAnsi="Georgia"/>
+          <w:sz w:val="21"/>
+          <w:szCs w:val="21"/>
+        </w:rPr>
+        <w:t xml:space="preserve"> tag was placed on the version 3.1 commit, and a Zenodo record's files cannot be replaced after minting. The paper now cites the concept DOI, 10.5281/zenodo.22641812, which resolves to the most recent version and does not need changing at each revision. Also released the result files Sections 5 and 6 depend on, which had never been published: </w:t>
+      </w:r>
+      <w:r>
+        <w:rPr>
+          <w:rFonts w:ascii="Consolas" w:cs="Consolas" w:eastAsia="Consolas" w:hAnsi="Consolas"/>
+          <w:sz w:val="19"/>
+          <w:szCs w:val="19"/>
+        </w:rPr>
+        <w:t xml:space="preserve">cluster_bootstrap.json</w:t>
+      </w:r>
+      <w:r>
+        <w:rPr>
+          <w:rFonts w:ascii="Georgia" w:cs="Georgia" w:eastAsia="Georgia" w:hAnsi="Georgia"/>
+          <w:sz w:val="21"/>
+          <w:szCs w:val="21"/>
+        </w:rPr>
+        <w:t xml:space="preserve"> and </w:t>
+      </w:r>
+      <w:r>
+        <w:rPr>
+          <w:rFonts w:ascii="Consolas" w:cs="Consolas" w:eastAsia="Consolas" w:hAnsi="Consolas"/>
+          <w:sz w:val="19"/>
+          <w:szCs w:val="19"/>
+        </w:rPr>
+        <w:t xml:space="preserve">design_effect_corrected.json</w:t>
+      </w:r>
+      <w:r>
+        <w:rPr>
+          <w:rFonts w:ascii="Georgia" w:cs="Georgia" w:eastAsia="Georgia" w:hAnsi="Georgia"/>
+          <w:sz w:val="21"/>
+          <w:szCs w:val="21"/>
+        </w:rPr>
+        <w:t xml:space="preserve"> carry the z values Section 6 reports, </w:t>
+      </w:r>
+      <w:r>
+        <w:rPr>
+          <w:rFonts w:ascii="Consolas" w:cs="Consolas" w:eastAsia="Consolas" w:hAnsi="Consolas"/>
+          <w:sz w:val="19"/>
+          <w:szCs w:val="19"/>
+        </w:rPr>
+        <w:t xml:space="preserve">publisher_clustering.json</w:t>
+      </w:r>
+      <w:r>
+        <w:rPr>
+          <w:rFonts w:ascii="Georgia" w:cs="Georgia" w:eastAsia="Georgia" w:hAnsi="Georgia"/>
+          <w:sz w:val="21"/>
+          <w:szCs w:val="21"/>
+        </w:rPr>
+        <w:t xml:space="preserve"> and </w:t>
+      </w:r>
+      <w:r>
+        <w:rPr>
+          <w:rFonts w:ascii="Consolas" w:cs="Consolas" w:eastAsia="Consolas" w:hAnsi="Consolas"/>
+          <w:sz w:val="19"/>
+          <w:szCs w:val="19"/>
+        </w:rPr>
+        <w:t xml:space="preserve">publisher_icc.json</w:t>
+      </w:r>
+      <w:r>
+        <w:rPr>
+          <w:rFonts w:ascii="Georgia" w:cs="Georgia" w:eastAsia="Georgia" w:hAnsi="Georgia"/>
+          <w:sz w:val="21"/>
+          <w:szCs w:val="21"/>
+        </w:rPr>
+        <w:t xml:space="preserve"> are the whole of Section 5, and the per-package validation records make the 6,144 of 6,146 figure reproducible rather than requiring a reader to sum two arm summaries, which reproduces the figure revision 3.1 retracts. The paper claimed its data was released; for those sections it was not.</w:t>
       </w:r>
     </w:p>
     <w:sectPr>

</xml_diff>